<commit_message>
Add trained model checkpoint + results so app runs standalone; sync papers
- checkpoints/multihead/multihead_final.pt: the actual trained multi-head
  GNN app.py loads at inference (previously only the small KPI surrogate
  was pushed, so a fresh clone couldn't run predictions)
- optimizer/guardrail/geometry_loop result JSONs+plots app.py reads for
  those tabs
- Paper/: sync latest CEJ/CACE/CES submission variants, new paper drafts,
  and the original CFD Example Plan reference doc
- .gitignore: exclude raw openfoam case dirs, per-epoch checkpoints, and
  validation case dumps (too large / not needed to run the app)

Co-Authored-By: Claude Sonnet 5 <noreply@anthropic.com>
</commit_message>
<xml_diff>
--- a/Paper/CFD Paper Instructions.docx
+++ b/Paper/CFD Paper Instructions.docx
@@ -1,6 +1,6 @@
 
 <file path=word/document.xml><?xml version="1.0" encoding="utf-8"?>
-<w:document xmlns:wpc="http://schemas.microsoft.com/office/word/2010/wordprocessingCanvas" xmlns:cx="http://schemas.microsoft.com/office/drawing/2014/chartex" xmlns:cx1="http://schemas.microsoft.com/office/drawing/2015/9/8/chartex" xmlns:cx2="http://schemas.microsoft.com/office/drawing/2015/10/21/chartex" xmlns:cx3="http://schemas.microsoft.com/office/drawing/2016/5/9/chartex" xmlns:cx4="http://schemas.microsoft.com/office/drawing/2016/5/10/chartex" xmlns:cx5="http://schemas.microsoft.com/office/drawing/2016/5/11/chartex" xmlns:cx6="http://schemas.microsoft.com/office/drawing/2016/5/12/chartex" xmlns:cx7="http://schemas.microsoft.com/office/drawing/2016/5/13/chartex" xmlns:cx8="http://schemas.microsoft.com/office/drawing/2016/5/14/chartex" xmlns:mc="http://schemas.openxmlformats.org/markup-compatibility/2006" xmlns:aink="http://schemas.microsoft.com/office/drawing/2016/ink" xmlns:am3d="http://schemas.microsoft.com/office/drawing/2017/model3d" xmlns:o="urn:schemas-microsoft-com:office:office" xmlns:oel="http://schemas.microsoft.com/office/2019/extlst" xmlns:r="http://schemas.openxmlformats.org/officeDocument/2006/relationships" xmlns:m="http://schemas.openxmlformats.org/officeDocument/2006/math" xmlns:v="urn:schemas-microsoft-com:vml" xmlns:wp14="http://schemas.microsoft.com/office/word/2010/wordprocessingDrawing" xmlns:wp="http://schemas.openxmlformats.org/drawingml/2006/wordprocessingDrawing" xmlns:w10="urn:schemas-microsoft-com:office:word" xmlns:w="http://schemas.openxmlformats.org/wordprocessingml/2006/main" xmlns:w14="http://schemas.microsoft.com/office/word/2010/wordml" xmlns:w15="http://schemas.microsoft.com/office/word/2012/wordml" xmlns:w16cex="http://schemas.microsoft.com/office/word/2018/wordml/cex" xmlns:w16cid="http://schemas.microsoft.com/office/word/2016/wordml/cid" xmlns:w16="http://schemas.microsoft.com/office/word/2018/wordml" xmlns:w16du="http://schemas.microsoft.com/office/word/2023/wordml/word16du" xmlns:w16sdtdh="http://schemas.microsoft.com/office/word/2020/wordml/sdtdatahash" xmlns:w16sdtfl="http://schemas.microsoft.com/office/word/2024/wordml/sdtformatlock" xmlns:w16se="http://schemas.microsoft.com/office/word/2015/wordml/symex" xmlns:wpg="http://schemas.microsoft.com/office/word/2010/wordprocessingGroup" xmlns:wpi="http://schemas.microsoft.com/office/word/2010/wordprocessingInk" xmlns:wne="http://schemas.microsoft.com/office/word/2006/wordml" xmlns:wps="http://schemas.microsoft.com/office/word/2010/wordprocessingShape" mc:Ignorable="w14 w15 w16se w16cid w16 w16cex w16sdtdh w16sdtfl w16du wp14">
+<w:document xmlns:wpc="http://schemas.microsoft.com/office/word/2010/wordprocessingCanvas" xmlns:cx="http://schemas.microsoft.com/office/drawing/2014/chartex" xmlns:cx1="http://schemas.microsoft.com/office/drawing/2015/9/8/chartex" xmlns:cx2="http://schemas.microsoft.com/office/drawing/2015/10/21/chartex" xmlns:cx3="http://schemas.microsoft.com/office/drawing/2016/5/9/chartex" xmlns:cx4="http://schemas.microsoft.com/office/drawing/2016/5/10/chartex" xmlns:cx5="http://schemas.microsoft.com/office/drawing/2016/5/11/chartex" xmlns:cx6="http://schemas.microsoft.com/office/drawing/2016/5/12/chartex" xmlns:cx7="http://schemas.microsoft.com/office/drawing/2016/5/13/chartex" xmlns:cx8="http://schemas.microsoft.com/office/drawing/2016/5/14/chartex" xmlns:mc="http://schemas.openxmlformats.org/markup-compatibility/2006" xmlns:m="http://schemas.openxmlformats.org/officeDocument/2006/math" xmlns:aink="http://schemas.microsoft.com/office/drawing/2016/ink" xmlns:am3d="http://schemas.microsoft.com/office/drawing/2017/model3d" xmlns:oel="http://schemas.microsoft.com/office/2019/extlst" xmlns:r="http://schemas.openxmlformats.org/officeDocument/2006/relationships" xmlns:wp14="http://schemas.microsoft.com/office/word/2010/wordprocessingDrawing" xmlns:wp="http://schemas.openxmlformats.org/drawingml/2006/wordprocessingDrawing" xmlns:wpg="http://schemas.microsoft.com/office/word/2010/wordprocessingGroup" xmlns:wpi="http://schemas.microsoft.com/office/word/2010/wordprocessingInk" xmlns:wps="http://schemas.microsoft.com/office/word/2010/wordprocessingShape" xmlns:o="urn:schemas-microsoft-com:office:office" xmlns:v="urn:schemas-microsoft-com:vml" xmlns:w10="urn:schemas-microsoft-com:office:word" xmlns:w="http://schemas.openxmlformats.org/wordprocessingml/2006/main" xmlns:w14="http://schemas.microsoft.com/office/word/2010/wordml" xmlns:w15="http://schemas.microsoft.com/office/word/2012/wordml" xmlns:w16cex="http://schemas.microsoft.com/office/word/2018/wordml/cex" xmlns:w16cid="http://schemas.microsoft.com/office/word/2016/wordml/cid" xmlns:w16="http://schemas.microsoft.com/office/word/2018/wordml" xmlns:w16sdtdh="http://schemas.microsoft.com/office/word/2020/wordml/sdtdatahash" xmlns:w16sdtfl="http://schemas.microsoft.com/office/word/2024/wordml/sdtformatlock" xmlns:w16se="http://schemas.microsoft.com/office/word/2015/wordml/symex" xmlns:w16du="http://schemas.microsoft.com/office/word/2023/wordml/word16du" xmlns:wne="http://schemas.microsoft.com/office/word/2006/wordml" mc:Ignorable="w14 w15 w16se w16cid w16 w16cex w16sdtdh w16sdtfl w16du wp14">
   <w:body>
     <w:p>
       <w:r>
@@ -75,6 +75,9 @@
       <w:r>
         <w:t>Ensure no overlap text in charts and architecture diagrams.</w:t>
       </w:r>
+      <w:r>
+        <w:t xml:space="preserve"> Keep all charts, images high resolution 500+DPI</w:t>
+      </w:r>
     </w:p>
     <w:p>
       <w:pPr>
@@ -149,90 +152,143 @@
       <w:r>
         <w:t xml:space="preserve">Ensure all citations and references are properly called out and are inline cited with numbers </w:t>
       </w:r>
+      <w:r>
+        <w:t>Infront</w:t>
+      </w:r>
+      <w:r>
+        <w:t xml:space="preserve"> of text.</w:t>
+      </w:r>
+    </w:p>
+    <w:p>
+      <w:pPr>
+        <w:pStyle w:val="ListParagraph"/>
+        <w:numPr>
+          <w:ilvl w:val="0"/>
+          <w:numId w:val="1"/>
+        </w:numPr>
+      </w:pPr>
+      <w:r>
+        <w:t xml:space="preserve">Ensure </w:t>
+      </w:r>
+      <w:r>
+        <w:t xml:space="preserve">Elsevier </w:t>
+      </w:r>
+      <w:r>
+        <w:t>IEEE, Springer or any chemical journal standard is maintained.</w:t>
+      </w:r>
+    </w:p>
+    <w:p>
+      <w:pPr>
+        <w:pStyle w:val="ListParagraph"/>
+        <w:numPr>
+          <w:ilvl w:val="0"/>
+          <w:numId w:val="1"/>
+        </w:numPr>
+      </w:pPr>
+      <w:r>
+        <w:t>My details you can copy from the above reference document.</w:t>
+      </w:r>
+    </w:p>
+    <w:p>
+      <w:pPr>
+        <w:pStyle w:val="ListParagraph"/>
+        <w:numPr>
+          <w:ilvl w:val="0"/>
+          <w:numId w:val="1"/>
+        </w:numPr>
+      </w:pPr>
+      <w:r>
+        <w:t xml:space="preserve">Provide industry </w:t>
+      </w:r>
+      <w:r>
+        <w:t>use cases</w:t>
+      </w:r>
+      <w:r>
+        <w:t xml:space="preserve"> as well, where this would be helpful</w:t>
+      </w:r>
+      <w:r>
+        <w:t xml:space="preserve">. As it is CFD anything to with aerospace, space, Semi-conductor, automotive, </w:t>
+      </w:r>
       <w:proofErr w:type="spellStart"/>
       <w:r>
-        <w:t>infront</w:t>
+        <w:t>etc</w:t>
       </w:r>
       <w:proofErr w:type="spellEnd"/>
       <w:r>
-        <w:t xml:space="preserve"> of text.</w:t>
-      </w:r>
-    </w:p>
-    <w:p>
-      <w:pPr>
-        <w:pStyle w:val="ListParagraph"/>
-        <w:numPr>
-          <w:ilvl w:val="0"/>
-          <w:numId w:val="1"/>
-        </w:numPr>
-      </w:pPr>
-      <w:r>
-        <w:t>Ensure IEEE, Springer or any chemical journal standard is maintained.</w:t>
-      </w:r>
-    </w:p>
-    <w:p>
-      <w:pPr>
-        <w:pStyle w:val="ListParagraph"/>
-        <w:numPr>
-          <w:ilvl w:val="0"/>
-          <w:numId w:val="1"/>
-        </w:numPr>
-      </w:pPr>
-      <w:r>
-        <w:t>My details you can copy from the above reference document.</w:t>
-      </w:r>
-    </w:p>
-    <w:p>
-      <w:pPr>
-        <w:pStyle w:val="ListParagraph"/>
-        <w:numPr>
-          <w:ilvl w:val="0"/>
-          <w:numId w:val="1"/>
-        </w:numPr>
-      </w:pPr>
-      <w:r>
-        <w:t xml:space="preserve">Provide industry </w:t>
+        <w:t>… can utilize this technique.</w:t>
+      </w:r>
+    </w:p>
+    <w:p>
+      <w:pPr>
+        <w:pStyle w:val="ListParagraph"/>
+        <w:numPr>
+          <w:ilvl w:val="0"/>
+          <w:numId w:val="1"/>
+        </w:numPr>
+      </w:pPr>
+      <w:r>
+        <w:t xml:space="preserve">Call out all the dimensionless quantities on heat, mass and momentum transfer which we have used in our </w:t>
+      </w:r>
+      <w:r>
+        <w:t>guardrails</w:t>
+      </w:r>
+      <w:r>
+        <w:t>, please do explain them on why we are having that.</w:t>
+      </w:r>
+    </w:p>
+    <w:p>
+      <w:pPr>
+        <w:pStyle w:val="ListParagraph"/>
+        <w:numPr>
+          <w:ilvl w:val="0"/>
+          <w:numId w:val="1"/>
+        </w:numPr>
+      </w:pPr>
+      <w:r>
+        <w:t>Explain forward and inverse flow with architecture/ flow diagram.</w:t>
+      </w:r>
+    </w:p>
+    <w:p>
+      <w:pPr>
+        <w:pStyle w:val="ListParagraph"/>
+        <w:numPr>
+          <w:ilvl w:val="0"/>
+          <w:numId w:val="1"/>
+        </w:numPr>
+      </w:pPr>
+      <w:r>
+        <w:t>Talk about the novel techniques we have built.</w:t>
+      </w:r>
+    </w:p>
+    <w:p>
+      <w:pPr>
+        <w:pStyle w:val="ListParagraph"/>
+        <w:numPr>
+          <w:ilvl w:val="0"/>
+          <w:numId w:val="1"/>
+        </w:numPr>
+      </w:pPr>
+      <w:r>
+        <w:t xml:space="preserve">Highlight the datasets details that we are using public data </w:t>
       </w:r>
       <w:proofErr w:type="spellStart"/>
       <w:r>
-        <w:t>usecases</w:t>
+        <w:t>DrivAernet</w:t>
       </w:r>
       <w:proofErr w:type="spellEnd"/>
       <w:r>
-        <w:t xml:space="preserve"> as well, where this would be helpful</w:t>
-      </w:r>
-    </w:p>
-    <w:p>
-      <w:pPr>
-        <w:pStyle w:val="ListParagraph"/>
-        <w:numPr>
-          <w:ilvl w:val="0"/>
-          <w:numId w:val="1"/>
-        </w:numPr>
-      </w:pPr>
-      <w:r>
-        <w:t xml:space="preserve">Call out all the dimensionless quantities on heat, mass and momentum transfer which we have used in our </w:t>
-      </w:r>
-      <w:r>
-        <w:t>guardrails</w:t>
-      </w:r>
-      <w:r>
-        <w:t>, please do explain them on why we are having that.</w:t>
-      </w:r>
-    </w:p>
-    <w:p>
-      <w:pPr>
-        <w:pStyle w:val="ListParagraph"/>
-        <w:numPr>
-          <w:ilvl w:val="0"/>
-          <w:numId w:val="1"/>
-        </w:numPr>
-      </w:pPr>
-      <w:r>
-        <w:t xml:space="preserve">Highlight the datasets details that we are using public data </w:t>
+        <w:t xml:space="preserve">++, </w:t>
       </w:r>
       <w:proofErr w:type="spellStart"/>
       <w:r>
+        <w:t>AhmedML</w:t>
+      </w:r>
+      <w:proofErr w:type="spellEnd"/>
+      <w:r>
+        <w:t xml:space="preserve">, </w:t>
+      </w:r>
+      <w:proofErr w:type="spellStart"/>
+      <w:r>
         <w:t>OpenFOAM</w:t>
       </w:r>
       <w:proofErr w:type="spellEnd"/>
@@ -274,6 +330,18 @@
       </w:pPr>
       <w:r>
         <w:t>Make this document state of the art and impressive, at the same time should not look very complex. Language should be so easy to understand by anyone.</w:t>
+      </w:r>
+    </w:p>
+    <w:p>
+      <w:pPr>
+        <w:pStyle w:val="ListParagraph"/>
+        <w:numPr>
+          <w:ilvl w:val="0"/>
+          <w:numId w:val="1"/>
+        </w:numPr>
+      </w:pPr>
+      <w:r>
+        <w:t>Please give page number to all the page in the footer below.</w:t>
       </w:r>
     </w:p>
     <w:sectPr>
@@ -287,7 +355,7 @@
 </file>
 
 <file path=word/numbering.xml><?xml version="1.0" encoding="utf-8"?>
-<w:numbering xmlns:wpc="http://schemas.microsoft.com/office/word/2010/wordprocessingCanvas" xmlns:cx="http://schemas.microsoft.com/office/drawing/2014/chartex" xmlns:cx1="http://schemas.microsoft.com/office/drawing/2015/9/8/chartex" xmlns:cx2="http://schemas.microsoft.com/office/drawing/2015/10/21/chartex" xmlns:cx3="http://schemas.microsoft.com/office/drawing/2016/5/9/chartex" xmlns:cx4="http://schemas.microsoft.com/office/drawing/2016/5/10/chartex" xmlns:cx5="http://schemas.microsoft.com/office/drawing/2016/5/11/chartex" xmlns:cx6="http://schemas.microsoft.com/office/drawing/2016/5/12/chartex" xmlns:cx7="http://schemas.microsoft.com/office/drawing/2016/5/13/chartex" xmlns:cx8="http://schemas.microsoft.com/office/drawing/2016/5/14/chartex" xmlns:mc="http://schemas.openxmlformats.org/markup-compatibility/2006" xmlns:aink="http://schemas.microsoft.com/office/drawing/2016/ink" xmlns:am3d="http://schemas.microsoft.com/office/drawing/2017/model3d" xmlns:o="urn:schemas-microsoft-com:office:office" xmlns:oel="http://schemas.microsoft.com/office/2019/extlst" xmlns:r="http://schemas.openxmlformats.org/officeDocument/2006/relationships" xmlns:m="http://schemas.openxmlformats.org/officeDocument/2006/math" xmlns:v="urn:schemas-microsoft-com:vml" xmlns:wp14="http://schemas.microsoft.com/office/word/2010/wordprocessingDrawing" xmlns:wp="http://schemas.openxmlformats.org/drawingml/2006/wordprocessingDrawing" xmlns:w10="urn:schemas-microsoft-com:office:word" xmlns:w="http://schemas.openxmlformats.org/wordprocessingml/2006/main" xmlns:w14="http://schemas.microsoft.com/office/word/2010/wordml" xmlns:w15="http://schemas.microsoft.com/office/word/2012/wordml" xmlns:w16cex="http://schemas.microsoft.com/office/word/2018/wordml/cex" xmlns:w16cid="http://schemas.microsoft.com/office/word/2016/wordml/cid" xmlns:w16="http://schemas.microsoft.com/office/word/2018/wordml" xmlns:w16du="http://schemas.microsoft.com/office/word/2023/wordml/word16du" xmlns:w16sdtdh="http://schemas.microsoft.com/office/word/2020/wordml/sdtdatahash" xmlns:w16sdtfl="http://schemas.microsoft.com/office/word/2024/wordml/sdtformatlock" xmlns:w16se="http://schemas.microsoft.com/office/word/2015/wordml/symex" xmlns:wpg="http://schemas.microsoft.com/office/word/2010/wordprocessingGroup" xmlns:wpi="http://schemas.microsoft.com/office/word/2010/wordprocessingInk" xmlns:wne="http://schemas.microsoft.com/office/word/2006/wordml" xmlns:wps="http://schemas.microsoft.com/office/word/2010/wordprocessingShape" mc:Ignorable="w14 w15 w16se w16cid w16 w16cex w16sdtdh w16sdtfl w16du wp14">
+<w:numbering xmlns:wpc="http://schemas.microsoft.com/office/word/2010/wordprocessingCanvas" xmlns:cx="http://schemas.microsoft.com/office/drawing/2014/chartex" xmlns:cx1="http://schemas.microsoft.com/office/drawing/2015/9/8/chartex" xmlns:cx2="http://schemas.microsoft.com/office/drawing/2015/10/21/chartex" xmlns:cx3="http://schemas.microsoft.com/office/drawing/2016/5/9/chartex" xmlns:cx4="http://schemas.microsoft.com/office/drawing/2016/5/10/chartex" xmlns:cx5="http://schemas.microsoft.com/office/drawing/2016/5/11/chartex" xmlns:cx6="http://schemas.microsoft.com/office/drawing/2016/5/12/chartex" xmlns:cx7="http://schemas.microsoft.com/office/drawing/2016/5/13/chartex" xmlns:cx8="http://schemas.microsoft.com/office/drawing/2016/5/14/chartex" xmlns:mc="http://schemas.openxmlformats.org/markup-compatibility/2006" xmlns:m="http://schemas.openxmlformats.org/officeDocument/2006/math" xmlns:aink="http://schemas.microsoft.com/office/drawing/2016/ink" xmlns:am3d="http://schemas.microsoft.com/office/drawing/2017/model3d" xmlns:oel="http://schemas.microsoft.com/office/2019/extlst" xmlns:r="http://schemas.openxmlformats.org/officeDocument/2006/relationships" xmlns:wp14="http://schemas.microsoft.com/office/word/2010/wordprocessingDrawing" xmlns:wp="http://schemas.openxmlformats.org/drawingml/2006/wordprocessingDrawing" xmlns:wpg="http://schemas.microsoft.com/office/word/2010/wordprocessingGroup" xmlns:wpi="http://schemas.microsoft.com/office/word/2010/wordprocessingInk" xmlns:wps="http://schemas.microsoft.com/office/word/2010/wordprocessingShape" xmlns:o="urn:schemas-microsoft-com:office:office" xmlns:v="urn:schemas-microsoft-com:vml" xmlns:w10="urn:schemas-microsoft-com:office:word" xmlns:w="http://schemas.openxmlformats.org/wordprocessingml/2006/main" xmlns:w14="http://schemas.microsoft.com/office/word/2010/wordml" xmlns:w15="http://schemas.microsoft.com/office/word/2012/wordml" xmlns:w16cex="http://schemas.microsoft.com/office/word/2018/wordml/cex" xmlns:w16cid="http://schemas.microsoft.com/office/word/2016/wordml/cid" xmlns:w16="http://schemas.microsoft.com/office/word/2018/wordml" xmlns:w16sdtdh="http://schemas.microsoft.com/office/word/2020/wordml/sdtdatahash" xmlns:w16sdtfl="http://schemas.microsoft.com/office/word/2024/wordml/sdtformatlock" xmlns:w16se="http://schemas.microsoft.com/office/word/2015/wordml/symex" xmlns:w16du="http://schemas.microsoft.com/office/word/2023/wordml/word16du" xmlns:wne="http://schemas.microsoft.com/office/word/2006/wordml" mc:Ignorable="w14 w15 w16se w16cid w16 w16cex w16sdtdh w16sdtfl w16du wp14">
   <w:abstractNum w:abstractNumId="0" w15:restartNumberingAfterBreak="0">
     <w:nsid w:val="31AC49E7"/>
     <w:multiLevelType w:val="hybridMultilevel"/>
@@ -384,7 +452,7 @@
 </file>
 
 <file path=word/styles.xml><?xml version="1.0" encoding="utf-8"?>
-<w:styles xmlns:mc="http://schemas.openxmlformats.org/markup-compatibility/2006" xmlns:r="http://schemas.openxmlformats.org/officeDocument/2006/relationships" xmlns:w="http://schemas.openxmlformats.org/wordprocessingml/2006/main" xmlns:w14="http://schemas.microsoft.com/office/word/2010/wordml" xmlns:w15="http://schemas.microsoft.com/office/word/2012/wordml" xmlns:w16cex="http://schemas.microsoft.com/office/word/2018/wordml/cex" xmlns:w16cid="http://schemas.microsoft.com/office/word/2016/wordml/cid" xmlns:w16="http://schemas.microsoft.com/office/word/2018/wordml" xmlns:w16du="http://schemas.microsoft.com/office/word/2023/wordml/word16du" xmlns:w16sdtdh="http://schemas.microsoft.com/office/word/2020/wordml/sdtdatahash" xmlns:w16sdtfl="http://schemas.microsoft.com/office/word/2024/wordml/sdtformatlock" xmlns:w16se="http://schemas.microsoft.com/office/word/2015/wordml/symex" mc:Ignorable="w14 w15 w16se w16cid w16 w16cex w16sdtdh w16sdtfl w16du">
+<w:styles xmlns:mc="http://schemas.openxmlformats.org/markup-compatibility/2006" xmlns:r="http://schemas.openxmlformats.org/officeDocument/2006/relationships" xmlns:w="http://schemas.openxmlformats.org/wordprocessingml/2006/main" xmlns:w14="http://schemas.microsoft.com/office/word/2010/wordml" xmlns:w15="http://schemas.microsoft.com/office/word/2012/wordml" xmlns:w16cex="http://schemas.microsoft.com/office/word/2018/wordml/cex" xmlns:w16cid="http://schemas.microsoft.com/office/word/2016/wordml/cid" xmlns:w16="http://schemas.microsoft.com/office/word/2018/wordml" xmlns:w16sdtdh="http://schemas.microsoft.com/office/word/2020/wordml/sdtdatahash" xmlns:w16sdtfl="http://schemas.microsoft.com/office/word/2024/wordml/sdtformatlock" xmlns:w16se="http://schemas.microsoft.com/office/word/2015/wordml/symex" xmlns:w16du="http://schemas.microsoft.com/office/word/2023/wordml/word16du" mc:Ignorable="w14 w15 w16se w16cid w16 w16cex w16sdtdh w16sdtfl w16du">
   <w:docDefaults>
     <w:rPrDefault>
       <w:rPr>

</xml_diff>